<commit_message>
c213: track manuscript + supplement PDFs and DOCX in repo
Previously the .gitignore excluded all build/ directories and the
supplementary/word/ tree, so a reader cloning the repo had to run
the LaTeX build to see the compiled outputs. Track them directly so
GitHub serves them on the web (~7 MB total: 332K conf manuscript,
472K journal manuscript, 4.4M for the 14 supplement PDFs, 1.8M for
the 16 DOCX files).

gitignore now ships explicit allow-list overrides for:
  conference/build/main.pdf
  journal/build/main.pdf
  supplementary/build/*.pdf  (14 files)
  conference/word/main.docx
  journal/word/main.docx
  supplementary/word/{conference,journal}/*.docx  (14 files)

Transient LaTeX .aux/.bbl/.log/etc are still gitignored.

All builds regenerated from the current sources (c211 Suppl I
extended to 9 figures; HIDSAG continuous-measurement extraction
shipping). Total file count tracked: 2 manuscript PDFs + 14
supplement PDFs + 2 manuscript DOCX + 14 supplement DOCX = 32
binary artefacts.
</commit_message>
<xml_diff>
--- a/conference/word/main.docx
+++ b/conference/word/main.docx
@@ -3476,13 +3476,25 @@
         <w:pStyle w:val="BodyText"/>
       </w:pPr>
       <w:r>
-        <w:t xml:space="preserve">We additionally evaluate on five HIDSAG mineral subsets (GEOMET,</w:t>
-      </w:r>
-      <w:r>
-        <w:t xml:space="preserve"> </w:t>
-      </w:r>
-      <w:r>
-        <w:t xml:space="preserve">MINERAL1, MINERAL2, GEOCHEM, PORPHYRY) under the same four masks.</w:t>
+        <w:t xml:space="preserve">We additionally evaluate on five HIDSAG mineral subsets</w:t>
+      </w:r>
+      <w:r>
+        <w:t xml:space="preserve"> </w:t>
+      </w:r>
+      <w:r>
+        <w:t xml:space="preserve">(Ehrenfeld et al. 2023; Ehrenfeld 2023)</w:t>
+      </w:r>
+      <w:r>
+        <w:t xml:space="preserve"> </w:t>
+      </w:r>
+      <w:r>
+        <w:t xml:space="preserve">(GEOMET, MINERAL1, MINERAL2,</w:t>
+      </w:r>
+      <w:r>
+        <w:t xml:space="preserve"> </w:t>
+      </w:r>
+      <w:r>
+        <w:t xml:space="preserve">GEOCHEM, PORPHYRY) under the same four masks.</w:t>
       </w:r>
       <w:r>
         <w:t xml:space="preserve"> </w:t>
@@ -4542,7 +4554,7 @@
       <w:r>
         <w:drawing>
           <wp:inline>
-            <wp:extent cx="4572000" cy="3657600"/>
+            <wp:extent cx="5334000" cy="2592795"/>
             <wp:effectExtent b="0" l="0" r="0" t="0"/>
             <wp:docPr descr="" title="" id="23" name="Picture"/>
             <a:graphic>
@@ -4563,7 +4575,7 @@
                   <pic:spPr bwMode="auto">
                     <a:xfrm>
                       <a:off x="0" y="0"/>
-                      <a:ext cx="4572000" cy="3657600"/>
+                      <a:ext cx="5334000" cy="2592795"/>
                     </a:xfrm>
                     <a:prstGeom prst="rect">
                       <a:avLst/>
@@ -5467,7 +5479,7 @@
       </w:r>
     </w:p>
     <w:bookmarkEnd w:id="32"/>
-    <w:bookmarkStart w:id="68" w:name="acknowledgements"/>
+    <w:bookmarkStart w:id="72" w:name="acknowledgements"/>
     <w:p>
       <w:pPr>
         <w:pStyle w:val="Heading1"/>
@@ -5502,7 +5514,7 @@
         <w:t xml:space="preserve">mineralogy with industrial partners in Chilean mining geosciences.</w:t>
       </w:r>
     </w:p>
-    <w:bookmarkStart w:id="67" w:name="refs"/>
+    <w:bookmarkStart w:id="71" w:name="refs"/>
     <w:bookmarkStart w:id="34" w:name="ref-baumgardner1992indianpines"/>
     <w:p>
       <w:pPr>
@@ -5742,12 +5754,122 @@
       </w:r>
     </w:p>
     <w:bookmarkEnd w:id="38"/>
-    <w:bookmarkStart w:id="40" w:name="ref-rosis_pavia"/>
+    <w:bookmarkStart w:id="40" w:name="ref-hidsag2023figshare"/>
     <w:p>
       <w:pPr>
         <w:pStyle w:val="Bibliography"/>
       </w:pPr>
       <w:r>
+        <w:t xml:space="preserve">Ehrenfeld, Alejandro. 2023.</w:t>
+      </w:r>
+      <w:r>
+        <w:t xml:space="preserve"> </w:t>
+      </w:r>
+      <w:r>
+        <w:rPr>
+          <w:i/>
+          <w:iCs/>
+        </w:rPr>
+        <w:t xml:space="preserve">HIDSAG</w:t>
+      </w:r>
+      <w:r>
+        <w:rPr>
+          <w:i/>
+          <w:iCs/>
+        </w:rPr>
+        <w:t xml:space="preserve">: Hyperspectral Image Database for Supervised Analysis in Geometallurgy</w:t>
+      </w:r>
+      <w:r>
+        <w:t xml:space="preserve">. Figshare Collection,</w:t>
+      </w:r>
+      <w:r>
+        <w:t xml:space="preserve"> </w:t>
+      </w:r>
+      <w:hyperlink r:id="rId39">
+        <w:r>
+          <w:rPr>
+            <w:rStyle w:val="Hyperlink"/>
+          </w:rPr>
+          <w:t xml:space="preserve">https://doi.org/10.6084/m9.figshare.c.5983921.v1</w:t>
+        </w:r>
+      </w:hyperlink>
+      <w:r>
+        <w:t xml:space="preserve">; figshare.</w:t>
+      </w:r>
+      <w:r>
+        <w:t xml:space="preserve"> </w:t>
+      </w:r>
+      <w:hyperlink r:id="rId39">
+        <w:r>
+          <w:rPr>
+            <w:rStyle w:val="Hyperlink"/>
+          </w:rPr>
+          <w:t xml:space="preserve">https://doi.org/10.6084/m9.figshare.c.5983921.v1</w:t>
+        </w:r>
+      </w:hyperlink>
+      <w:r>
+        <w:t xml:space="preserve">.</w:t>
+      </w:r>
+    </w:p>
+    <w:bookmarkEnd w:id="40"/>
+    <w:bookmarkStart w:id="42" w:name="ref-hidsag2023"/>
+    <w:p>
+      <w:pPr>
+        <w:pStyle w:val="Bibliography"/>
+      </w:pPr>
+      <w:r>
+        <w:t xml:space="preserve">Ehrenfeld, Alejandro, Álvaro F. Egaña, Felipe Santibañez-Leal, et al. 2023.</w:t>
+      </w:r>
+      <w:r>
+        <w:t xml:space="preserve"> </w:t>
+      </w:r>
+      <w:r>
+        <w:t xml:space="preserve">“</w:t>
+      </w:r>
+      <w:r>
+        <w:t xml:space="preserve">HIDSAG</w:t>
+      </w:r>
+      <w:r>
+        <w:t xml:space="preserve">: Hyperspectral Image Database for Supervised Analysis in Geometallurgy.”</w:t>
+      </w:r>
+      <w:r>
+        <w:t xml:space="preserve"> </w:t>
+      </w:r>
+      <w:r>
+        <w:rPr>
+          <w:i/>
+          <w:iCs/>
+        </w:rPr>
+        <w:t xml:space="preserve">Scientific Data</w:t>
+      </w:r>
+      <w:r>
+        <w:t xml:space="preserve"> </w:t>
+      </w:r>
+      <w:r>
+        <w:t xml:space="preserve">10 (1): 164.</w:t>
+      </w:r>
+      <w:r>
+        <w:t xml:space="preserve"> </w:t>
+      </w:r>
+      <w:hyperlink r:id="rId41">
+        <w:r>
+          <w:rPr>
+            <w:rStyle w:val="Hyperlink"/>
+          </w:rPr>
+          <w:t xml:space="preserve">https://doi.org/10.1038/s41597-023-02061-x</w:t>
+        </w:r>
+      </w:hyperlink>
+      <w:r>
+        <w:t xml:space="preserve">.</w:t>
+      </w:r>
+    </w:p>
+    <w:bookmarkEnd w:id="42"/>
+    <w:bookmarkStart w:id="44" w:name="ref-rosis_pavia"/>
+    <w:p>
+      <w:pPr>
+        <w:pStyle w:val="Bibliography"/>
+      </w:pPr>
+      <w:r>
         <w:t xml:space="preserve">German Aerospace Center (DLR) ROSIS sensor. 2003.</w:t>
       </w:r>
       <w:r>
@@ -5808,7 +5930,7 @@
       <w:r>
         <w:t xml:space="preserve"> </w:t>
       </w:r>
-      <w:hyperlink r:id="rId39">
+      <w:hyperlink r:id="rId43">
         <w:r>
           <w:rPr>
             <w:rStyle w:val="Hyperlink"/>
@@ -5820,8 +5942,8 @@
         <w:t xml:space="preserve">.</w:t>
       </w:r>
     </w:p>
-    <w:bookmarkEnd w:id="40"/>
-    <w:bookmarkStart w:id="42" w:name="ref-griffiths2004finding"/>
+    <w:bookmarkEnd w:id="44"/>
+    <w:bookmarkStart w:id="46" w:name="ref-griffiths2004finding"/>
     <w:p>
       <w:pPr>
         <w:pStyle w:val="Bibliography"/>
@@ -5854,7 +5976,7 @@
       <w:r>
         <w:t xml:space="preserve"> </w:t>
       </w:r>
-      <w:hyperlink r:id="rId41">
+      <w:hyperlink r:id="rId45">
         <w:r>
           <w:rPr>
             <w:rStyle w:val="Hyperlink"/>
@@ -5866,8 +5988,8 @@
         <w:t xml:space="preserve">.</w:t>
       </w:r>
     </w:p>
-    <w:bookmarkEnd w:id="42"/>
-    <w:bookmarkStart w:id="44" w:name="ref-hoffman2010online"/>
+    <w:bookmarkEnd w:id="46"/>
+    <w:bookmarkStart w:id="48" w:name="ref-hoffman2010online"/>
     <w:p>
       <w:pPr>
         <w:pStyle w:val="Bibliography"/>
@@ -5919,7 +6041,7 @@
       <w:r>
         <w:t xml:space="preserve"> </w:t>
       </w:r>
-      <w:hyperlink r:id="rId43">
+      <w:hyperlink r:id="rId47">
         <w:r>
           <w:rPr>
             <w:rStyle w:val="Hyperlink"/>
@@ -5931,8 +6053,8 @@
         <w:t xml:space="preserve">.</w:t>
       </w:r>
     </w:p>
-    <w:bookmarkEnd w:id="44"/>
-    <w:bookmarkStart w:id="46" w:name="ref-hubert1985ari"/>
+    <w:bookmarkEnd w:id="48"/>
+    <w:bookmarkStart w:id="50" w:name="ref-hubert1985ari"/>
     <w:p>
       <w:pPr>
         <w:pStyle w:val="Bibliography"/>
@@ -5965,7 +6087,7 @@
       <w:r>
         <w:t xml:space="preserve"> </w:t>
       </w:r>
-      <w:hyperlink r:id="rId45">
+      <w:hyperlink r:id="rId49">
         <w:r>
           <w:rPr>
             <w:rStyle w:val="Hyperlink"/>
@@ -5977,8 +6099,8 @@
         <w:t xml:space="preserve">.</w:t>
       </w:r>
     </w:p>
-    <w:bookmarkEnd w:id="46"/>
-    <w:bookmarkStart w:id="48" w:name="ref-kuhn1955hungarian"/>
+    <w:bookmarkEnd w:id="50"/>
+    <w:bookmarkStart w:id="52" w:name="ref-kuhn1955hungarian"/>
     <w:p>
       <w:pPr>
         <w:pStyle w:val="Bibliography"/>
@@ -6023,7 +6145,7 @@
       <w:r>
         <w:t xml:space="preserve"> </w:t>
       </w:r>
-      <w:hyperlink r:id="rId47">
+      <w:hyperlink r:id="rId51">
         <w:r>
           <w:rPr>
             <w:rStyle w:val="Hyperlink"/>
@@ -6035,8 +6157,8 @@
         <w:t xml:space="preserve">.</w:t>
       </w:r>
     </w:p>
-    <w:bookmarkEnd w:id="48"/>
-    <w:bookmarkStart w:id="50" w:name="ref-liu2019hsilda"/>
+    <w:bookmarkEnd w:id="52"/>
+    <w:bookmarkStart w:id="54" w:name="ref-liu2019hsilda"/>
     <w:p>
       <w:pPr>
         <w:pStyle w:val="Bibliography"/>
@@ -6081,7 +6203,7 @@
       <w:r>
         <w:t xml:space="preserve"> </w:t>
       </w:r>
-      <w:hyperlink r:id="rId49">
+      <w:hyperlink r:id="rId53">
         <w:r>
           <w:rPr>
             <w:rStyle w:val="Hyperlink"/>
@@ -6093,8 +6215,8 @@
         <w:t xml:space="preserve">.</w:t>
       </w:r>
     </w:p>
-    <w:bookmarkEnd w:id="50"/>
-    <w:bookmarkStart w:id="52" w:name="ref-eo1_botswana"/>
+    <w:bookmarkEnd w:id="54"/>
+    <w:bookmarkStart w:id="56" w:name="ref-eo1_botswana"/>
     <w:p>
       <w:pPr>
         <w:pStyle w:val="Bibliography"/>
@@ -6160,7 +6282,7 @@
       <w:r>
         <w:t xml:space="preserve"> </w:t>
       </w:r>
-      <w:hyperlink r:id="rId51">
+      <w:hyperlink r:id="rId55">
         <w:r>
           <w:rPr>
             <w:rStyle w:val="Hyperlink"/>
@@ -6172,8 +6294,8 @@
         <w:t xml:space="preserve">.</w:t>
       </w:r>
     </w:p>
-    <w:bookmarkEnd w:id="52"/>
-    <w:bookmarkStart w:id="54" w:name="ref-aviris_ksc"/>
+    <w:bookmarkEnd w:id="56"/>
+    <w:bookmarkStart w:id="58" w:name="ref-aviris_ksc"/>
     <w:p>
       <w:pPr>
         <w:pStyle w:val="Bibliography"/>
@@ -6253,7 +6375,7 @@
       <w:r>
         <w:t xml:space="preserve"> </w:t>
       </w:r>
-      <w:hyperlink r:id="rId53">
+      <w:hyperlink r:id="rId57">
         <w:r>
           <w:rPr>
             <w:rStyle w:val="Hyperlink"/>
@@ -6265,8 +6387,8 @@
         <w:t xml:space="preserve">.</w:t>
       </w:r>
     </w:p>
-    <w:bookmarkEnd w:id="54"/>
-    <w:bookmarkStart w:id="56" w:name="ref-aviris_salinas"/>
+    <w:bookmarkEnd w:id="58"/>
+    <w:bookmarkStart w:id="60" w:name="ref-aviris_salinas"/>
     <w:p>
       <w:pPr>
         <w:pStyle w:val="Bibliography"/>
@@ -6332,7 +6454,7 @@
       <w:r>
         <w:t xml:space="preserve"> </w:t>
       </w:r>
-      <w:hyperlink r:id="rId55">
+      <w:hyperlink r:id="rId59">
         <w:r>
           <w:rPr>
             <w:rStyle w:val="Hyperlink"/>
@@ -6344,8 +6466,8 @@
         <w:t xml:space="preserve">.</w:t>
       </w:r>
     </w:p>
-    <w:bookmarkEnd w:id="56"/>
-    <w:bookmarkStart w:id="58" w:name="ref-pedregosa2011scikit"/>
+    <w:bookmarkEnd w:id="60"/>
+    <w:bookmarkStart w:id="62" w:name="ref-pedregosa2011scikit"/>
     <w:p>
       <w:pPr>
         <w:pStyle w:val="Bibliography"/>
@@ -6387,7 +6509,7 @@
       <w:r>
         <w:t xml:space="preserve"> </w:t>
       </w:r>
-      <w:hyperlink r:id="rId57">
+      <w:hyperlink r:id="rId61">
         <w:r>
           <w:rPr>
             <w:rStyle w:val="Hyperlink"/>
@@ -6399,8 +6521,8 @@
         <w:t xml:space="preserve">.</w:t>
       </w:r>
     </w:p>
-    <w:bookmarkEnd w:id="58"/>
-    <w:bookmarkStart w:id="60" w:name="ref-plaza2009recent"/>
+    <w:bookmarkEnd w:id="62"/>
+    <w:bookmarkStart w:id="64" w:name="ref-plaza2009recent"/>
     <w:p>
       <w:pPr>
         <w:pStyle w:val="Bibliography"/>
@@ -6433,7 +6555,7 @@
       <w:r>
         <w:t xml:space="preserve"> </w:t>
       </w:r>
-      <w:hyperlink r:id="rId59">
+      <w:hyperlink r:id="rId63">
         <w:r>
           <w:rPr>
             <w:rStyle w:val="Hyperlink"/>
@@ -6445,8 +6567,8 @@
         <w:t xml:space="preserve">.</w:t>
       </w:r>
     </w:p>
-    <w:bookmarkEnd w:id="60"/>
-    <w:bookmarkStart w:id="62" w:name="ref-scipy_assignment"/>
+    <w:bookmarkEnd w:id="64"/>
+    <w:bookmarkStart w:id="66" w:name="ref-scipy_assignment"/>
     <w:p>
       <w:pPr>
         <w:pStyle w:val="Bibliography"/>
@@ -6513,7 +6635,7 @@
       <w:r>
         <w:t xml:space="preserve"> </w:t>
       </w:r>
-      <w:hyperlink r:id="rId61">
+      <w:hyperlink r:id="rId65">
         <w:r>
           <w:rPr>
             <w:rStyle w:val="Hyperlink"/>
@@ -6525,8 +6647,8 @@
         <w:t xml:space="preserve">.</w:t>
       </w:r>
     </w:p>
-    <w:bookmarkEnd w:id="62"/>
-    <w:bookmarkStart w:id="64" w:name="ref-vinh2010information"/>
+    <w:bookmarkEnd w:id="66"/>
+    <w:bookmarkStart w:id="68" w:name="ref-vinh2010information"/>
     <w:p>
       <w:pPr>
         <w:pStyle w:val="Bibliography"/>
@@ -6559,7 +6681,7 @@
       <w:r>
         <w:t xml:space="preserve"> </w:t>
       </w:r>
-      <w:hyperlink r:id="rId63">
+      <w:hyperlink r:id="rId67">
         <w:r>
           <w:rPr>
             <w:rStyle w:val="Hyperlink"/>
@@ -6571,8 +6693,8 @@
         <w:t xml:space="preserve">.</w:t>
       </w:r>
     </w:p>
-    <w:bookmarkEnd w:id="64"/>
-    <w:bookmarkStart w:id="66" w:name="ref-zou2017pmlda"/>
+    <w:bookmarkEnd w:id="68"/>
+    <w:bookmarkStart w:id="70" w:name="ref-zou2017pmlda"/>
     <w:p>
       <w:pPr>
         <w:pStyle w:val="Bibliography"/>
@@ -6617,7 +6739,7 @@
       <w:r>
         <w:t xml:space="preserve"> </w:t>
       </w:r>
-      <w:hyperlink r:id="rId65">
+      <w:hyperlink r:id="rId69">
         <w:r>
           <w:rPr>
             <w:rStyle w:val="Hyperlink"/>
@@ -6629,9 +6751,9 @@
         <w:t xml:space="preserve">.</w:t>
       </w:r>
     </w:p>
-    <w:bookmarkEnd w:id="66"/>
-    <w:bookmarkEnd w:id="67"/>
-    <w:bookmarkEnd w:id="68"/>
+    <w:bookmarkEnd w:id="70"/>
+    <w:bookmarkEnd w:id="71"/>
+    <w:bookmarkEnd w:id="72"/>
     <w:sectPr>
       <w:footnotePr>
         <w:numRestart w:val="eachSect"/>

</xml_diff>